<commit_message>
Add collection proof letter
</commit_message>
<xml_diff>
--- a/docassemble/MADebtCollectionLetter/data/templates/cease_letter.docx
+++ b/docassemble/MADebtCollectionLetter/data/templates/cease_letter.docx
@@ -1,6 +1,6 @@
 
 <file path=word/document.xml><?xml version="1.0" encoding="utf-8"?>
-<w:document xmlns:wpc="http://schemas.microsoft.com/office/word/2010/wordprocessingCanvas" xmlns:cx="http://schemas.microsoft.com/office/drawing/2014/chartex" xmlns:cx1="http://schemas.microsoft.com/office/drawing/2015/9/8/chartex" xmlns:cx2="http://schemas.microsoft.com/office/drawing/2015/10/21/chartex" xmlns:cx3="http://schemas.microsoft.com/office/drawing/2016/5/9/chartex" xmlns:cx4="http://schemas.microsoft.com/office/drawing/2016/5/10/chartex" xmlns:cx5="http://schemas.microsoft.com/office/drawing/2016/5/11/chartex" xmlns:cx6="http://schemas.microsoft.com/office/drawing/2016/5/12/chartex" xmlns:cx7="http://schemas.microsoft.com/office/drawing/2016/5/13/chartex" xmlns:cx8="http://schemas.microsoft.com/office/drawing/2016/5/14/chartex" xmlns:mc="http://schemas.openxmlformats.org/markup-compatibility/2006" xmlns:aink="http://schemas.microsoft.com/office/drawing/2016/ink" xmlns:am3d="http://schemas.microsoft.com/office/drawing/2017/model3d" xmlns:o="urn:schemas-microsoft-com:office:office" xmlns:oel="http://schemas.microsoft.com/office/2019/extlst" xmlns:r="http://schemas.openxmlformats.org/officeDocument/2006/relationships" xmlns:m="http://schemas.openxmlformats.org/officeDocument/2006/math" xmlns:v="urn:schemas-microsoft-com:vml" xmlns:wp14="http://schemas.microsoft.com/office/word/2010/wordprocessingDrawing" xmlns:wp="http://schemas.openxmlformats.org/drawingml/2006/wordprocessingDrawing" xmlns:w10="urn:schemas-microsoft-com:office:word" xmlns:w="http://schemas.openxmlformats.org/wordprocessingml/2006/main" xmlns:w14="http://schemas.microsoft.com/office/word/2010/wordml" xmlns:w15="http://schemas.microsoft.com/office/word/2012/wordml" xmlns:w16cex="http://schemas.microsoft.com/office/word/2018/wordml/cex" xmlns:w16cid="http://schemas.microsoft.com/office/word/2016/wordml/cid" xmlns:w16="http://schemas.microsoft.com/office/word/2018/wordml" xmlns:w16sdtdh="http://schemas.microsoft.com/office/word/2020/wordml/sdtdatahash" xmlns:w16se="http://schemas.microsoft.com/office/word/2015/wordml/symex" xmlns:wpg="http://schemas.microsoft.com/office/word/2010/wordprocessingGroup" xmlns:wpi="http://schemas.microsoft.com/office/word/2010/wordprocessingInk" xmlns:wne="http://schemas.microsoft.com/office/word/2006/wordml" xmlns:wps="http://schemas.microsoft.com/office/word/2010/wordprocessingShape" mc:Ignorable="w14 w15 w16se w16cid w16 w16cex w16sdtdh wp14">
+<w:document xmlns:wpc="http://schemas.microsoft.com/office/word/2010/wordprocessingCanvas" xmlns:cx="http://schemas.microsoft.com/office/drawing/2014/chartex" xmlns:cx1="http://schemas.microsoft.com/office/drawing/2015/9/8/chartex" xmlns:cx2="http://schemas.microsoft.com/office/drawing/2015/10/21/chartex" xmlns:cx3="http://schemas.microsoft.com/office/drawing/2016/5/9/chartex" xmlns:cx4="http://schemas.microsoft.com/office/drawing/2016/5/10/chartex" xmlns:cx5="http://schemas.microsoft.com/office/drawing/2016/5/11/chartex" xmlns:cx6="http://schemas.microsoft.com/office/drawing/2016/5/12/chartex" xmlns:cx7="http://schemas.microsoft.com/office/drawing/2016/5/13/chartex" xmlns:cx8="http://schemas.microsoft.com/office/drawing/2016/5/14/chartex" xmlns:mc="http://schemas.openxmlformats.org/markup-compatibility/2006" xmlns:aink="http://schemas.microsoft.com/office/drawing/2016/ink" xmlns:am3d="http://schemas.microsoft.com/office/drawing/2017/model3d" xmlns:o="urn:schemas-microsoft-com:office:office" xmlns:oel="http://schemas.microsoft.com/office/2019/extlst" xmlns:r="http://schemas.openxmlformats.org/officeDocument/2006/relationships" xmlns:m="http://schemas.openxmlformats.org/officeDocument/2006/math" xmlns:v="urn:schemas-microsoft-com:vml" xmlns:wp14="http://schemas.microsoft.com/office/word/2010/wordprocessingDrawing" xmlns:wp="http://schemas.openxmlformats.org/drawingml/2006/wordprocessingDrawing" xmlns:w10="urn:schemas-microsoft-com:office:word" xmlns:w="http://schemas.openxmlformats.org/wordprocessingml/2006/main" xmlns:w14="http://schemas.microsoft.com/office/word/2010/wordml" xmlns:w15="http://schemas.microsoft.com/office/word/2012/wordml" xmlns:w16cex="http://schemas.microsoft.com/office/word/2018/wordml/cex" xmlns:w16cid="http://schemas.microsoft.com/office/word/2016/wordml/cid" xmlns:w16="http://schemas.microsoft.com/office/word/2018/wordml" xmlns:w16du="http://schemas.microsoft.com/office/word/2023/wordml/word16du" xmlns:w16sdtdh="http://schemas.microsoft.com/office/word/2020/wordml/sdtdatahash" xmlns:w16se="http://schemas.microsoft.com/office/word/2015/wordml/symex" xmlns:wpg="http://schemas.microsoft.com/office/word/2010/wordprocessingGroup" xmlns:wpi="http://schemas.microsoft.com/office/word/2010/wordprocessingInk" xmlns:wne="http://schemas.microsoft.com/office/word/2006/wordml" xmlns:wps="http://schemas.microsoft.com/office/word/2010/wordprocessingShape" mc:Ignorable="w14 w15 w16se w16cid w16 w16cex w16sdtdh w16du wp14">
   <w:body>
     <w:p>
       <w:pPr>
@@ -48,12 +48,60 @@
     </w:p>
     <w:p>
       <w:pPr>
-        <w:pStyle w:val="NormalWeb"/>
-        <w:shd w:val="clear" w:color="auto" w:fill="FFFFFF"/>
-      </w:pPr>
-      <w:r>
-        <w:br/>
-      </w:r>
+        <w:tabs>
+          <w:tab w:val="left" w:pos="204"/>
+        </w:tabs>
+      </w:pPr>
+    </w:p>
+    <w:p>
+      <w:pPr>
+        <w:tabs>
+          <w:tab w:val="left" w:pos="204"/>
+        </w:tabs>
+      </w:pPr>
+      <w:r>
+        <w:t xml:space="preserve">{%p if </w:t>
+      </w:r>
+      <w:r>
+        <w:t>user_has_account_number</w:t>
+      </w:r>
+      <w:r>
+        <w:t xml:space="preserve"> %}</w:t>
+      </w:r>
+    </w:p>
+    <w:p>
+      <w:pPr>
+        <w:tabs>
+          <w:tab w:val="left" w:pos="204"/>
+        </w:tabs>
+      </w:pPr>
+      <w:r>
+        <w:t xml:space="preserve">Account number: </w:t>
+      </w:r>
+      <w:r>
+        <w:rPr>
+          <w:b/>
+          <w:bCs/>
+        </w:rPr>
+        <w:t>{{ debt_account_number }}</w:t>
+      </w:r>
+    </w:p>
+    <w:p>
+      <w:pPr>
+        <w:tabs>
+          <w:tab w:val="left" w:pos="204"/>
+        </w:tabs>
+      </w:pPr>
+      <w:r>
+        <w:t>{%p endif %}</w:t>
+      </w:r>
+    </w:p>
+    <w:p>
+      <w:pPr>
+        <w:tabs>
+          <w:tab w:val="left" w:pos="204"/>
+        </w:tabs>
+      </w:pPr>
       <w:r>
         <w:t>R</w:t>
       </w:r>
@@ -61,23 +109,29 @@
         <w:t xml:space="preserve">e: </w:t>
       </w:r>
       <w:r>
-        <w:t xml:space="preserve">{{ users[0].name.full() }} </w:t>
-      </w:r>
-      <w:r>
-        <w:t xml:space="preserve">and </w:t>
-      </w:r>
-      <w:r>
-        <w:t>{{ users[0].account_number }}</w:t>
+        <w:rPr>
+          <w:b/>
+          <w:bCs/>
+        </w:rPr>
+        <w:t>{{ users[0].name</w:t>
+      </w:r>
+      <w:r>
+        <w:rPr>
+          <w:b/>
+          <w:bCs/>
+        </w:rPr>
+        <w:t>_</w:t>
+      </w:r>
+      <w:r>
+        <w:rPr>
+          <w:b/>
+          <w:bCs/>
+        </w:rPr>
+        <w:t>full() }}</w:t>
       </w:r>
       <w:r>
         <w:t xml:space="preserve"> </w:t>
       </w:r>
-    </w:p>
-    <w:p>
-      <w:pPr>
-        <w:pStyle w:val="NormalWeb"/>
-        <w:shd w:val="clear" w:color="auto" w:fill="FFFFFF"/>
-      </w:pPr>
     </w:p>
     <w:p>
       <w:pPr>
@@ -156,6 +210,16 @@
       </w:r>
       <w:r>
         <w:t>,</w:t>
+      </w:r>
+    </w:p>
+    <w:p>
+      <w:pPr>
+        <w:pStyle w:val="NormalWeb"/>
+        <w:shd w:val="clear" w:color="auto" w:fill="FFFFFF"/>
+        <w:spacing w:before="240" w:beforeAutospacing="0" w:line="480" w:lineRule="auto"/>
+      </w:pPr>
+      <w:r>
+        <w:t>{{ users[0].signature_if_final(i) }}</w:t>
       </w:r>
     </w:p>
     <w:p>
@@ -205,7 +269,7 @@
 </file>
 
 <file path=word/numbering.xml><?xml version="1.0" encoding="utf-8"?>
-<w:numbering xmlns:wpc="http://schemas.microsoft.com/office/word/2010/wordprocessingCanvas" xmlns:cx="http://schemas.microsoft.com/office/drawing/2014/chartex" xmlns:cx1="http://schemas.microsoft.com/office/drawing/2015/9/8/chartex" xmlns:cx2="http://schemas.microsoft.com/office/drawing/2015/10/21/chartex" xmlns:cx3="http://schemas.microsoft.com/office/drawing/2016/5/9/chartex" xmlns:cx4="http://schemas.microsoft.com/office/drawing/2016/5/10/chartex" xmlns:cx5="http://schemas.microsoft.com/office/drawing/2016/5/11/chartex" xmlns:cx6="http://schemas.microsoft.com/office/drawing/2016/5/12/chartex" xmlns:cx7="http://schemas.microsoft.com/office/drawing/2016/5/13/chartex" xmlns:cx8="http://schemas.microsoft.com/office/drawing/2016/5/14/chartex" xmlns:mc="http://schemas.openxmlformats.org/markup-compatibility/2006" xmlns:aink="http://schemas.microsoft.com/office/drawing/2016/ink" xmlns:am3d="http://schemas.microsoft.com/office/drawing/2017/model3d" xmlns:o="urn:schemas-microsoft-com:office:office" xmlns:oel="http://schemas.microsoft.com/office/2019/extlst" xmlns:r="http://schemas.openxmlformats.org/officeDocument/2006/relationships" xmlns:m="http://schemas.openxmlformats.org/officeDocument/2006/math" xmlns:v="urn:schemas-microsoft-com:vml" xmlns:wp14="http://schemas.microsoft.com/office/word/2010/wordprocessingDrawing" xmlns:wp="http://schemas.openxmlformats.org/drawingml/2006/wordprocessingDrawing" xmlns:w10="urn:schemas-microsoft-com:office:word" xmlns:w="http://schemas.openxmlformats.org/wordprocessingml/2006/main" xmlns:w14="http://schemas.microsoft.com/office/word/2010/wordml" xmlns:w15="http://schemas.microsoft.com/office/word/2012/wordml" xmlns:w16cex="http://schemas.microsoft.com/office/word/2018/wordml/cex" xmlns:w16cid="http://schemas.microsoft.com/office/word/2016/wordml/cid" xmlns:w16="http://schemas.microsoft.com/office/word/2018/wordml" xmlns:w16sdtdh="http://schemas.microsoft.com/office/word/2020/wordml/sdtdatahash" xmlns:w16se="http://schemas.microsoft.com/office/word/2015/wordml/symex" xmlns:wpg="http://schemas.microsoft.com/office/word/2010/wordprocessingGroup" xmlns:wpi="http://schemas.microsoft.com/office/word/2010/wordprocessingInk" xmlns:wne="http://schemas.microsoft.com/office/word/2006/wordml" xmlns:wps="http://schemas.microsoft.com/office/word/2010/wordprocessingShape" mc:Ignorable="w14 w15 w16se w16cid w16 w16cex w16sdtdh wp14">
+<w:numbering xmlns:wpc="http://schemas.microsoft.com/office/word/2010/wordprocessingCanvas" xmlns:cx="http://schemas.microsoft.com/office/drawing/2014/chartex" xmlns:cx1="http://schemas.microsoft.com/office/drawing/2015/9/8/chartex" xmlns:cx2="http://schemas.microsoft.com/office/drawing/2015/10/21/chartex" xmlns:cx3="http://schemas.microsoft.com/office/drawing/2016/5/9/chartex" xmlns:cx4="http://schemas.microsoft.com/office/drawing/2016/5/10/chartex" xmlns:cx5="http://schemas.microsoft.com/office/drawing/2016/5/11/chartex" xmlns:cx6="http://schemas.microsoft.com/office/drawing/2016/5/12/chartex" xmlns:cx7="http://schemas.microsoft.com/office/drawing/2016/5/13/chartex" xmlns:cx8="http://schemas.microsoft.com/office/drawing/2016/5/14/chartex" xmlns:mc="http://schemas.openxmlformats.org/markup-compatibility/2006" xmlns:aink="http://schemas.microsoft.com/office/drawing/2016/ink" xmlns:am3d="http://schemas.microsoft.com/office/drawing/2017/model3d" xmlns:o="urn:schemas-microsoft-com:office:office" xmlns:oel="http://schemas.microsoft.com/office/2019/extlst" xmlns:r="http://schemas.openxmlformats.org/officeDocument/2006/relationships" xmlns:m="http://schemas.openxmlformats.org/officeDocument/2006/math" xmlns:v="urn:schemas-microsoft-com:vml" xmlns:wp14="http://schemas.microsoft.com/office/word/2010/wordprocessingDrawing" xmlns:wp="http://schemas.openxmlformats.org/drawingml/2006/wordprocessingDrawing" xmlns:w10="urn:schemas-microsoft-com:office:word" xmlns:w="http://schemas.openxmlformats.org/wordprocessingml/2006/main" xmlns:w14="http://schemas.microsoft.com/office/word/2010/wordml" xmlns:w15="http://schemas.microsoft.com/office/word/2012/wordml" xmlns:w16cex="http://schemas.microsoft.com/office/word/2018/wordml/cex" xmlns:w16cid="http://schemas.microsoft.com/office/word/2016/wordml/cid" xmlns:w16="http://schemas.microsoft.com/office/word/2018/wordml" xmlns:w16du="http://schemas.microsoft.com/office/word/2023/wordml/word16du" xmlns:w16sdtdh="http://schemas.microsoft.com/office/word/2020/wordml/sdtdatahash" xmlns:w16se="http://schemas.microsoft.com/office/word/2015/wordml/symex" xmlns:wpg="http://schemas.microsoft.com/office/word/2010/wordprocessingGroup" xmlns:wpi="http://schemas.microsoft.com/office/word/2010/wordprocessingInk" xmlns:wne="http://schemas.microsoft.com/office/word/2006/wordml" xmlns:wps="http://schemas.microsoft.com/office/word/2010/wordprocessingShape" mc:Ignorable="w14 w15 w16se w16cid w16 w16cex w16sdtdh w16du wp14">
   <w:abstractNum w:abstractNumId="0" w15:restartNumberingAfterBreak="0">
     <w:nsid w:val="55DE602E"/>
     <w:multiLevelType w:val="hybridMultilevel"/>
@@ -326,7 +390,7 @@
 </file>
 
 <file path=word/styles.xml><?xml version="1.0" encoding="utf-8"?>
-<w:styles xmlns:mc="http://schemas.openxmlformats.org/markup-compatibility/2006" xmlns:r="http://schemas.openxmlformats.org/officeDocument/2006/relationships" xmlns:w="http://schemas.openxmlformats.org/wordprocessingml/2006/main" xmlns:w14="http://schemas.microsoft.com/office/word/2010/wordml" xmlns:w15="http://schemas.microsoft.com/office/word/2012/wordml" xmlns:w16cex="http://schemas.microsoft.com/office/word/2018/wordml/cex" xmlns:w16cid="http://schemas.microsoft.com/office/word/2016/wordml/cid" xmlns:w16="http://schemas.microsoft.com/office/word/2018/wordml" xmlns:w16sdtdh="http://schemas.microsoft.com/office/word/2020/wordml/sdtdatahash" xmlns:w16se="http://schemas.microsoft.com/office/word/2015/wordml/symex" mc:Ignorable="w14 w15 w16se w16cid w16 w16cex w16sdtdh">
+<w:styles xmlns:mc="http://schemas.openxmlformats.org/markup-compatibility/2006" xmlns:r="http://schemas.openxmlformats.org/officeDocument/2006/relationships" xmlns:w="http://schemas.openxmlformats.org/wordprocessingml/2006/main" xmlns:w14="http://schemas.microsoft.com/office/word/2010/wordml" xmlns:w15="http://schemas.microsoft.com/office/word/2012/wordml" xmlns:w16cex="http://schemas.microsoft.com/office/word/2018/wordml/cex" xmlns:w16cid="http://schemas.microsoft.com/office/word/2016/wordml/cid" xmlns:w16="http://schemas.microsoft.com/office/word/2018/wordml" xmlns:w16du="http://schemas.microsoft.com/office/word/2023/wordml/word16du" xmlns:w16sdtdh="http://schemas.microsoft.com/office/word/2020/wordml/sdtdatahash" xmlns:w16se="http://schemas.microsoft.com/office/word/2015/wordml/symex" mc:Ignorable="w14 w15 w16se w16cid w16 w16cex w16sdtdh w16du">
   <w:docDefaults>
     <w:rPrDefault>
       <w:rPr>

</xml_diff>